<commit_message>
docs(lab02): verificación de las Fases 2 y 3 sobre el robot real
Guía 02 (Markdown, constructor y .docx regenerado, revisión 4):

- Faltaban ros-jazzy-camera-calibration-parsers y ros-jazzy-camera-info-manager: sin
  ellos kinova_vision no compila.
- Clonado en el workspace, aplicación idempotente del parche de parada limpia y
  compilación sólo de kinova_vision; paso final que verifica la parada.
- Nombre real del parámetro: .image_raw.compressed.jpeg_quality, valor inicial 95.
- La Tabla 3 calcula el video crudo: ros2 topic bw se suscribe en best effort y midió
  1.88 MB/s frente a ≈162 MB/s reales.
- Nota sobre los Mbps del monitor de red, que suman el loopback.
- El .docx heredaba "7-DOF" en materiales; se corrige a 6-DOF.

Incluye los CSV del monitor de red de las mediciones por WiFi (escenarios lab02_A/B/C)
y la aclaración del loopback en MONITOR_RED_CONTROLES_Y_CONFIGURACION.md.

Co-Authored-By: Claude Opus 5 <noreply@anthropic.com>
</commit_message>
<xml_diff>
--- a/education/guias_laboratorio/GUIA_LAB_02_PRUEBAS_CAMARA_KINOVA_VISION.docx
+++ b/education/guias_laboratorio/GUIA_LAB_02_PRUEBAS_CAMARA_KINOVA_VISION.docx
@@ -247,7 +247,7 @@
               </w:rPr>
               <w:t>Revisión No.:</w:t>
               <w:br/>
-              <w:t>3</w:t>
+              <w:t>4</w:t>
             </w:r>
           </w:p>
         </w:tc>
@@ -797,6 +797,7 @@
                 <w:b w:val="0"/>
                 <w:sz w:val="16"/>
               </w:rPr>
+              <w:t>Verificación de las Fases 2 y 3 sobre el robot real</w:t>
             </w:r>
           </w:p>
         </w:tc>
@@ -826,6 +827,7 @@
                 <w:b w:val="0"/>
                 <w:sz w:val="16"/>
               </w:rPr>
+              <w:t>Dependencias camera_calibration_parsers y camera_info_manager; parche de parada limpia del driver kinova_vision (no se detenía con Ctrl+C y bloqueaba la cámara); nombre real del parámetro JPEG; el video crudo se calcula porque ros2 topic bw no lo mide correctamente.</w:t>
             </w:r>
           </w:p>
         </w:tc>
@@ -856,6 +858,7 @@
                 <w:b w:val="0"/>
                 <w:sz w:val="16"/>
               </w:rPr>
+              <w:t>15/09/2026</w:t>
             </w:r>
           </w:p>
         </w:tc>
@@ -3132,7 +3135,7 @@
                 <w:b w:val="0"/>
                 <w:sz w:val="16"/>
               </w:rPr>
-              <w:t>Brazo manipulador Kinova Gen3 (7-DOF) con módulo de visión integrado</w:t>
+              <w:t>Brazo manipulador Kinova Gen3 (6-DOF) con módulo de visión integrado en la muñeca</w:t>
             </w:r>
           </w:p>
         </w:tc>
@@ -4097,7 +4100,7 @@
           <w:i w:val="0"/>
           <w:sz w:val="18"/>
         </w:rPr>
-        <w:t>1. Configure en Dispositivo A (Gateway): Ethernet 192.168.1.100/24 y Wi-Fi 192.168.50.10/24. En Dispositivo B: Wi-Fi 192.168.50.20/24.</w:t>
+        <w:t>1. El laboratorio usa UNA sola subred 192.168.1.0/24 (router TP-Link AX12 en 192.168.1.1, SSID ros2). Robot Kinova: 192.168.1.10 estática. Dispositivo A (anfitriona): 192.168.1.100 por reserva DHCP. Dispositivo B: IP del pool DHCP 192.168.1.101-254. Confirme la suya con ip -brief addr y verifique con ping 192.168.1.1 y ping 192.168.1.10.</w:t>
       </w:r>
     </w:p>
     <w:p>
@@ -4131,7 +4134,7 @@
           <w:i w:val="0"/>
           <w:sz w:val="18"/>
         </w:rPr>
-        <w:t>3. Abra el navegador en http://localhost:8080 (o http://192.168.50.10:8080 desde Dispositivo B). Inicie la sesión de grabación de telemetría.</w:t>
+        <w:t>3. Abra el navegador en http://localhost:8080 (o http://192.168.1.100:8080 desde Dispositivo B). Inicie la sesión de grabación de telemetría.</w:t>
       </w:r>
     </w:p>
     <w:p>
@@ -4163,7 +4166,7 @@
           <w:i w:val="0"/>
           <w:sz w:val="18"/>
         </w:rPr>
-        <w:t>1. En Dispositivo A, ejecute: python3 ~/ros2_ws/src/burger_delivery/scripts/test_kinova_camera.py --ip 192.168.1.10 --stream color</w:t>
+        <w:t>1. REQUISITO PREVIO: instale los plugins de GStreamer (el stream de profundidad los exige): sudo apt install -y gstreamer1.0-tools gstreamer1.0-plugins-base gstreamer1.0-plugins-good gstreamer1.0-plugins-bad gstreamer1.0-plugins-ugly gstreamer1.0-libav</w:t>
       </w:r>
     </w:p>
     <w:p>
@@ -4180,7 +4183,58 @@
           <w:i w:val="0"/>
           <w:sz w:val="18"/>
         </w:rPr>
-        <w:t>2. Compruebe tasa de cuadros (&gt;= 25 FPS), flujo Depth (--stream depth) y capture 3 imágenes de calibración con tecla 's'.</w:t>
+        <w:t>2. En Dispositivo A, ejecute: python3 ~/ros2_ws/src/burger_delivery/scripts/test_kinova_camera.py --ip 192.168.1.10 --stream color</w:t>
+      </w:r>
+    </w:p>
+    <w:p>
+      <w:pPr>
+        <w:keepNext w:val="0"/>
+        <w:spacing w:before="0" w:after="80" w:line="240" w:lineRule="auto"/>
+        <w:ind w:left="312" w:hanging="255"/>
+        <w:jc w:val="left"/>
+      </w:pPr>
+      <w:r>
+        <w:rPr>
+          <w:rFonts w:ascii="Arial" w:hAnsi="Arial"/>
+          <w:b w:val="0"/>
+          <w:i w:val="0"/>
+          <w:sz w:val="18"/>
+        </w:rPr>
+        <w:t>3. Compruebe tasa de cuadros (&gt;= 25 FPS) y capture 3 imágenes de calibración con la tecla 's'.</w:t>
+      </w:r>
+    </w:p>
+    <w:p>
+      <w:pPr>
+        <w:keepNext w:val="0"/>
+        <w:spacing w:before="0" w:after="80" w:line="240" w:lineRule="auto"/>
+        <w:ind w:left="312" w:hanging="255"/>
+        <w:jc w:val="left"/>
+      </w:pPr>
+      <w:r>
+        <w:rPr>
+          <w:rFonts w:ascii="Arial" w:hAnsi="Arial"/>
+          <w:b w:val="0"/>
+          <w:i w:val="0"/>
+          <w:sz w:val="18"/>
+        </w:rPr>
+        <w:t>4. Ejecute el flujo de profundidad: --stream depth. Este stream usa payload RTP X-GST y solo abre con GStreamer (rtpgstdepay); FFMPEG falla por diseño, no por red. Llega en GRAY16_LE 480x270 con la distancia en milímetros.</w:t>
+      </w:r>
+    </w:p>
+    <w:p>
+      <w:pPr>
+        <w:keepNext w:val="0"/>
+        <w:spacing w:before="0" w:after="80" w:line="240" w:lineRule="auto"/>
+        <w:ind w:left="312" w:hanging="255"/>
+        <w:jc w:val="left"/>
+      </w:pPr>
+      <w:r>
+        <w:rPr>
+          <w:rFonts w:ascii="Arial" w:hAnsi="Arial"/>
+          <w:b w:val="0"/>
+          <w:i w:val="0"/>
+          <w:sz w:val="18"/>
+        </w:rPr>
+        <w:t>5. Si aparece 'No URI handler implemented for rtsp' seguido de 'CAP_IMAGES: can't find starting number', faltan los plugins del paso 1: no es una falla del robot.</w:t>
       </w:r>
     </w:p>
     <w:p>
@@ -4212,7 +4266,7 @@
           <w:i w:val="0"/>
           <w:sz w:val="18"/>
         </w:rPr>
-        <w:t>1. En Dispositivo A, lance el publicador de visión: ros2 launch burger_delivery robot.launch.py</w:t>
+        <w:t>1. INSTALACIÓN PREVIA: el driver de visión está en un repositorio aparte de ros2_kortex. Instale dependencias: sudo apt install -y gstreamer1.0-tools gstreamer1.0-libav libgstreamer1.0-dev libgstreamer-plugins-base1.0-dev libgstreamer-plugins-good1.0-dev gstreamer1.0-plugins-base gstreamer1.0-plugins-good ros-jazzy-image-transport-plugins ros-jazzy-image-view ros-jazzy-depth-image-proc ros-jazzy-camera-calibration-parsers ros-jazzy-camera-info-manager (sin los dos últimos kinova_vision no compila).</w:t>
       </w:r>
     </w:p>
     <w:p>
@@ -4229,7 +4283,7 @@
           <w:i w:val="0"/>
           <w:sz w:val="18"/>
         </w:rPr>
-        <w:t>2. Mida con ros2 topic bw el ancho de banda crudo vs comprimido (/camera/color/image_raw/compressed) y calcule el ahorro en la Tabla 3.</w:t>
+        <w:t>2. Clone el driver en el workspace, junto a ros2_kortex y NO dentro de burger_delivery: cd ~/ros2_ws/src &amp;&amp; git clone -b ros2 https://github.com/Kinovarobotics/ros2_kortex_vision.git</w:t>
       </w:r>
     </w:p>
     <w:p>
@@ -4246,7 +4300,109 @@
           <w:i w:val="0"/>
           <w:sz w:val="18"/>
         </w:rPr>
-        <w:t>3. Ajuste dinámicamente jpeg_quality (80 vs 30) mediante: ros2 param set /camera/camera_node_driver jpeg_quality 80</w:t>
+        <w:t>3. Aplique el parche de parada limpia antes de compilar: cd ~/ros2_ws/src/ros2_kortex_vision &amp;&amp; git apply ~/ros2_ws/src/burger_delivery/ros2_setup/parches/kinova_vision_parada_limpia.patch (si ya está aplicado, git apply --reverse --check lo confirma). Compile sólo este paquete: cd ~/ros2_ws &amp;&amp; colcon build --packages-select kinova_vision --symlink-install. Sin el parche el driver no se detiene limpiamente con Ctrl+C y deja la cámara rechazando streams (TROUBLESHOOTING.md §3.4).</w:t>
+      </w:r>
+    </w:p>
+    <w:p>
+      <w:pPr>
+        <w:keepNext w:val="0"/>
+        <w:spacing w:before="0" w:after="80" w:line="240" w:lineRule="auto"/>
+        <w:ind w:left="312" w:hanging="255"/>
+        <w:jc w:val="left"/>
+      </w:pPr>
+      <w:r>
+        <w:rPr>
+          <w:rFonts w:ascii="Arial" w:hAnsi="Arial"/>
+          <w:b w:val="0"/>
+          <w:i w:val="0"/>
+          <w:sz w:val="18"/>
+        </w:rPr>
+        <w:t>4. Sin ros-jazzy-image-transport-plugins el nodo solo publica el tópico crudo y /compressed nunca aparece. Verifique con: ros2 run image_transport list_transports</w:t>
+      </w:r>
+    </w:p>
+    <w:p>
+      <w:pPr>
+        <w:keepNext w:val="0"/>
+        <w:spacing w:before="0" w:after="80" w:line="240" w:lineRule="auto"/>
+        <w:ind w:left="312" w:hanging="255"/>
+        <w:jc w:val="left"/>
+      </w:pPr>
+      <w:r>
+        <w:rPr>
+          <w:rFonts w:ascii="Arial" w:hAnsi="Arial"/>
+          <w:b w:val="0"/>
+          <w:i w:val="0"/>
+          <w:sz w:val="18"/>
+        </w:rPr>
+        <w:t>5. En Dispositivo A, lance el publicador de visión: ros2 launch kinova_vision kinova_vision.launch.py device:=192.168.1.10</w:t>
+      </w:r>
+    </w:p>
+    <w:p>
+      <w:pPr>
+        <w:keepNext w:val="0"/>
+        <w:spacing w:before="0" w:after="80" w:line="240" w:lineRule="auto"/>
+        <w:ind w:left="312" w:hanging="255"/>
+        <w:jc w:val="left"/>
+      </w:pPr>
+      <w:r>
+        <w:rPr>
+          <w:rFonts w:ascii="Arial" w:hAnsi="Arial"/>
+          <w:b w:val="0"/>
+          <w:i w:val="0"/>
+          <w:sz w:val="18"/>
+        </w:rPr>
+        <w:t>6. Verifique los nodos /camera/kinova_vision_color y /camera/kinova_vision_depth con: ros2 node list | grep kinova_vision</w:t>
+      </w:r>
+    </w:p>
+    <w:p>
+      <w:pPr>
+        <w:keepNext w:val="0"/>
+        <w:spacing w:before="0" w:after="80" w:line="240" w:lineRule="auto"/>
+        <w:ind w:left="312" w:hanging="255"/>
+        <w:jc w:val="left"/>
+      </w:pPr>
+      <w:r>
+        <w:rPr>
+          <w:rFonts w:ascii="Arial" w:hAnsi="Arial"/>
+          <w:b w:val="0"/>
+          <w:i w:val="0"/>
+          <w:sz w:val="18"/>
+        </w:rPr>
+        <w:t>7. NO mida el tópico crudo con ros2 topic bw: se suscribe en best effort y cada imagen de 6.22 MB viaja en miles de fragmentos (medido: 1.88 MB/s frente a ≈162 MB/s reales). Calcule el crudo como ancho × alto × 3 × FPS, tomando los FPS de ros2 topic hz sobre /camera/color/image_raw/compressed, y mida el comprimido con ros2 topic bw. Registre ambos y el ahorro en la Tabla 3.</w:t>
+      </w:r>
+    </w:p>
+    <w:p>
+      <w:pPr>
+        <w:keepNext w:val="0"/>
+        <w:spacing w:before="0" w:after="80" w:line="240" w:lineRule="auto"/>
+        <w:ind w:left="312" w:hanging="255"/>
+        <w:jc w:val="left"/>
+      </w:pPr>
+      <w:r>
+        <w:rPr>
+          <w:rFonts w:ascii="Arial" w:hAnsi="Arial"/>
+          <w:b w:val="0"/>
+          <w:i w:val="0"/>
+          <w:sz w:val="18"/>
+        </w:rPr>
+        <w:t>8. Parámetro de calidad JPEG: ros2 param list /camera/kinova_vision_color | grep -i jpeg devuelve .image_raw.compressed.jpeg_quality (con punto inicial, valor inicial 95). Aplíquelo con ros2 param set /camera/kinova_vision_color .image_raw.compressed.jpeg_quality 30 y compare q=80 vs q=30.</w:t>
+      </w:r>
+    </w:p>
+    <w:p>
+      <w:pPr>
+        <w:keepNext w:val="0"/>
+        <w:spacing w:before="0" w:after="80" w:line="240" w:lineRule="auto"/>
+        <w:ind w:left="312" w:hanging="255"/>
+        <w:jc w:val="left"/>
+      </w:pPr>
+      <w:r>
+        <w:rPr>
+          <w:rFonts w:ascii="Arial" w:hAnsi="Arial"/>
+          <w:b w:val="0"/>
+          <w:i w:val="0"/>
+          <w:sz w:val="18"/>
+        </w:rPr>
+        <w:t>9. Detenga el driver con Ctrl+C y verifique la parada limpia: ambos nodos con 'process has finished cleanly', pgrep -a -x kinova_vision_n vacío y sin líneas ESTAB en ss -tanp | grep 192.168.1.10:554. Un proceso huérfano mantiene la sesión RTSP y bloquea la cámara para las demás estaciones.</w:t>
       </w:r>
     </w:p>
     <w:p>
@@ -4278,7 +4434,7 @@
           <w:i w:val="0"/>
           <w:sz w:val="18"/>
         </w:rPr>
-        <w:t>1. En ambos dispositivos exporte: export RMW_IMPLEMENTATION=rmw_cyclonedds_cpp y el mismo ROS_DOMAIN_ID.</w:t>
+        <w:t>1. En ambos dispositivos exporte: export RMW_IMPLEMENTATION=rmw_cyclonedds_cpp, el mismo ROS_DOMAIN_ID y la RUTA ABSOLUTA del perfil: export CYCLONEDDS_URI=file://$HOME/ros2_ws/src/burger_delivery/network_setup/cyclonedds.xml</w:t>
       </w:r>
     </w:p>
     <w:p>
@@ -4295,7 +4451,7 @@
           <w:i w:val="0"/>
           <w:sz w:val="18"/>
         </w:rPr>
-        <w:t>2. Cree el archivo cyclonedds.xml definiendo NetworkInterfaceAddress (wlan0) y MaxMessageSize (65500B).</w:t>
+        <w:t>2. El perfil network_setup/cyclonedds.xml autodetecta la interfaz y no requiere edicion en equipos con una sola NIC. Solo en el Dispositivo A (dual-homed) comente el bloque autodetermine y fije su interfaz Wi-Fi real (ip -brief addr). En CycloneDDS 0.10 la interfaz se fija con Interfaces/NetworkInterface: el antiguo NetworkInterfaceAddress ya no existe. Compare MaxMessageSize 8192B (Wi-Fi) contra 65500B (Ethernet).</w:t>
       </w:r>
     </w:p>
     <w:p>
@@ -4312,7 +4468,24 @@
           <w:i w:val="0"/>
           <w:sz w:val="18"/>
         </w:rPr>
-        <w:t>3. Desde Dispositivo B (Wi-Fi), mida la frecuencia remota y visualice el flujo con image_view, observando el tráfico en el Monitor de Red.</w:t>
+        <w:t>3. Desde Dispositivo B (Wi-Fi), mida la frecuencia remota y visualice con la sintaxis ROS 2 (la de ROS 1 se ignora en silencio): ros2 run image_view image_view --ros-args -r image:=/camera/color/image_raw -p image_transport:=compressed</w:t>
+      </w:r>
+    </w:p>
+    <w:p>
+      <w:pPr>
+        <w:keepNext w:val="0"/>
+        <w:spacing w:before="0" w:after="80" w:line="240" w:lineRule="auto"/>
+        <w:ind w:left="312" w:hanging="255"/>
+        <w:jc w:val="left"/>
+      </w:pPr>
+      <w:r>
+        <w:rPr>
+          <w:rFonts w:ascii="Arial" w:hAnsi="Arial"/>
+          <w:b w:val="0"/>
+          <w:i w:val="0"/>
+          <w:sz w:val="18"/>
+        </w:rPr>
+        <w:t>4. En el Monitor de Red, el RTT, el jitter y la pérdida son mediciones (ping); sus Mbps suman el loopback y reparten TCP/UDP/DDS con proporciones fijas. Para el tráfico real de la interfaz WiFi siga TROUBLESHOOTING.md §4.8. Si el monitor arranca en 8081, el 8080 estaba ocupado: use el puerto que anuncia.</w:t>
       </w:r>
     </w:p>
     <w:p>
@@ -5050,7 +5223,7 @@
                 <w:b w:val="0"/>
                 <w:sz w:val="14"/>
               </w:rPr>
-              <w:t>192.168.50.20 -&gt; 192.168.50.10</w:t>
+              <w:t>192.168.1.101 -&gt; 192.168.1.100</w:t>
             </w:r>
           </w:p>
         </w:tc>
@@ -5200,6 +5373,222 @@
               <w:end w:w="90" w:type="dxa"/>
             </w:tcMar>
             <w:shd w:fill="F2F2F2"/>
+            <w:vAlign w:val="center"/>
+          </w:tcPr>
+          <w:p>
+            <w:pPr>
+              <w:spacing w:after="0" w:before="0"/>
+              <w:jc w:val="left"/>
+            </w:pPr>
+            <w:r/>
+            <w:r>
+              <w:rPr>
+                <w:rFonts w:ascii="Arial" w:hAnsi="Arial"/>
+                <w:b w:val="0"/>
+                <w:sz w:val="14"/>
+              </w:rPr>
+            </w:r>
+          </w:p>
+        </w:tc>
+      </w:tr>
+      <w:tr>
+        <w:trPr>
+          <w:cantSplit/>
+        </w:trPr>
+        <w:tc>
+          <w:tcPr>
+            <w:tcW w:type="dxa" w:w="2268"/>
+            <w:tcMar>
+              <w:top w:w="90" w:type="dxa"/>
+              <w:start w:w="90" w:type="dxa"/>
+              <w:bottom w:w="90" w:type="dxa"/>
+              <w:end w:w="90" w:type="dxa"/>
+            </w:tcMar>
+            <w:vAlign w:val="center"/>
+          </w:tcPr>
+          <w:p>
+            <w:pPr>
+              <w:spacing w:after="0" w:before="0"/>
+              <w:jc w:val="left"/>
+            </w:pPr>
+            <w:r/>
+            <w:r>
+              <w:rPr>
+                <w:rFonts w:ascii="Arial" w:hAnsi="Arial"/>
+                <w:b w:val="0"/>
+                <w:sz w:val="14"/>
+              </w:rPr>
+              <w:t>Inalámbrico (Disp. B -&gt; Kinova)</w:t>
+            </w:r>
+          </w:p>
+        </w:tc>
+        <w:tc>
+          <w:tcPr>
+            <w:tcW w:type="dxa" w:w="2268"/>
+            <w:tcMar>
+              <w:top w:w="90" w:type="dxa"/>
+              <w:start w:w="90" w:type="dxa"/>
+              <w:bottom w:w="90" w:type="dxa"/>
+              <w:end w:w="90" w:type="dxa"/>
+            </w:tcMar>
+            <w:vAlign w:val="center"/>
+          </w:tcPr>
+          <w:p>
+            <w:pPr>
+              <w:spacing w:after="0" w:before="0"/>
+              <w:jc w:val="left"/>
+            </w:pPr>
+            <w:r/>
+            <w:r>
+              <w:rPr>
+                <w:rFonts w:ascii="Arial" w:hAnsi="Arial"/>
+                <w:b w:val="0"/>
+                <w:sz w:val="14"/>
+              </w:rPr>
+              <w:t>192.168.1.101 -&gt; 192.168.1.10</w:t>
+            </w:r>
+          </w:p>
+        </w:tc>
+        <w:tc>
+          <w:tcPr>
+            <w:tcW w:type="dxa" w:w="1134"/>
+            <w:tcMar>
+              <w:top w:w="90" w:type="dxa"/>
+              <w:start w:w="90" w:type="dxa"/>
+              <w:bottom w:w="90" w:type="dxa"/>
+              <w:end w:w="90" w:type="dxa"/>
+            </w:tcMar>
+            <w:vAlign w:val="center"/>
+          </w:tcPr>
+          <w:p>
+            <w:pPr>
+              <w:spacing w:after="0" w:before="0"/>
+              <w:jc w:val="left"/>
+            </w:pPr>
+            <w:r/>
+            <w:r>
+              <w:rPr>
+                <w:rFonts w:ascii="Arial" w:hAnsi="Arial"/>
+                <w:b w:val="0"/>
+                <w:sz w:val="14"/>
+              </w:rPr>
+              <w:t>10 / ___</w:t>
+            </w:r>
+          </w:p>
+        </w:tc>
+        <w:tc>
+          <w:tcPr>
+            <w:tcW w:type="dxa" w:w="1020"/>
+            <w:tcMar>
+              <w:top w:w="90" w:type="dxa"/>
+              <w:start w:w="90" w:type="dxa"/>
+              <w:bottom w:w="90" w:type="dxa"/>
+              <w:end w:w="90" w:type="dxa"/>
+            </w:tcMar>
+            <w:vAlign w:val="center"/>
+          </w:tcPr>
+          <w:p>
+            <w:pPr>
+              <w:spacing w:after="0" w:before="0"/>
+              <w:jc w:val="left"/>
+            </w:pPr>
+            <w:r/>
+            <w:r>
+              <w:rPr>
+                <w:rFonts w:ascii="Arial" w:hAnsi="Arial"/>
+                <w:b w:val="0"/>
+                <w:sz w:val="14"/>
+              </w:rPr>
+            </w:r>
+          </w:p>
+        </w:tc>
+        <w:tc>
+          <w:tcPr>
+            <w:tcW w:type="dxa" w:w="1020"/>
+            <w:tcMar>
+              <w:top w:w="90" w:type="dxa"/>
+              <w:start w:w="90" w:type="dxa"/>
+              <w:bottom w:w="90" w:type="dxa"/>
+              <w:end w:w="90" w:type="dxa"/>
+            </w:tcMar>
+            <w:vAlign w:val="center"/>
+          </w:tcPr>
+          <w:p>
+            <w:pPr>
+              <w:spacing w:after="0" w:before="0"/>
+              <w:jc w:val="left"/>
+            </w:pPr>
+            <w:r/>
+            <w:r>
+              <w:rPr>
+                <w:rFonts w:ascii="Arial" w:hAnsi="Arial"/>
+                <w:b w:val="0"/>
+                <w:sz w:val="14"/>
+              </w:rPr>
+            </w:r>
+          </w:p>
+        </w:tc>
+        <w:tc>
+          <w:tcPr>
+            <w:tcW w:type="dxa" w:w="1020"/>
+            <w:tcMar>
+              <w:top w:w="90" w:type="dxa"/>
+              <w:start w:w="90" w:type="dxa"/>
+              <w:bottom w:w="90" w:type="dxa"/>
+              <w:end w:w="90" w:type="dxa"/>
+            </w:tcMar>
+            <w:vAlign w:val="center"/>
+          </w:tcPr>
+          <w:p>
+            <w:pPr>
+              <w:spacing w:after="0" w:before="0"/>
+              <w:jc w:val="left"/>
+            </w:pPr>
+            <w:r/>
+            <w:r>
+              <w:rPr>
+                <w:rFonts w:ascii="Arial" w:hAnsi="Arial"/>
+                <w:b w:val="0"/>
+                <w:sz w:val="14"/>
+              </w:rPr>
+            </w:r>
+          </w:p>
+        </w:tc>
+        <w:tc>
+          <w:tcPr>
+            <w:tcW w:type="dxa" w:w="1020"/>
+            <w:tcMar>
+              <w:top w:w="90" w:type="dxa"/>
+              <w:start w:w="90" w:type="dxa"/>
+              <w:bottom w:w="90" w:type="dxa"/>
+              <w:end w:w="90" w:type="dxa"/>
+            </w:tcMar>
+            <w:vAlign w:val="center"/>
+          </w:tcPr>
+          <w:p>
+            <w:pPr>
+              <w:spacing w:after="0" w:before="0"/>
+              <w:jc w:val="left"/>
+            </w:pPr>
+            <w:r/>
+            <w:r>
+              <w:rPr>
+                <w:rFonts w:ascii="Arial" w:hAnsi="Arial"/>
+                <w:b w:val="0"/>
+                <w:sz w:val="14"/>
+              </w:rPr>
+            </w:r>
+          </w:p>
+        </w:tc>
+        <w:tc>
+          <w:tcPr>
+            <w:tcW w:type="dxa" w:w="1020"/>
+            <w:tcMar>
+              <w:top w:w="90" w:type="dxa"/>
+              <w:start w:w="90" w:type="dxa"/>
+              <w:bottom w:w="90" w:type="dxa"/>
+              <w:end w:w="90" w:type="dxa"/>
+            </w:tcMar>
             <w:vAlign w:val="center"/>
           </w:tcPr>
           <w:p>
@@ -5615,7 +6004,7 @@
                 <w:b w:val="0"/>
                 <w:sz w:val="15"/>
               </w:rPr>
-              <w:t>FFMPEG TCP</w:t>
+              <w:t>GStreamer (rtpgstdepay, GRAY16_LE)</w:t>
             </w:r>
           </w:p>
         </w:tc>
@@ -6123,7 +6512,7 @@
                 <w:color w:val="FFFFFF"/>
                 <w:sz w:val="15"/>
               </w:rPr>
-              <w:t>Ancho de Banda (ros2 topic bw)</w:t>
+              <w:t>Ancho de Banda (crudo: calculado · comprimido: ros2 topic bw)</w:t>
             </w:r>
           </w:p>
         </w:tc>
@@ -6152,7 +6541,7 @@
                 <w:color w:val="FFFFFF"/>
                 <w:sz w:val="15"/>
               </w:rPr>
-              <w:t>Tasa de Cuadros (hz)</w:t>
+              <w:t>Tasa de Cuadros (hz del comprimido)</w:t>
             </w:r>
           </w:p>
         </w:tc>
@@ -6267,6 +6656,7 @@
                 <w:b w:val="0"/>
                 <w:sz w:val="15"/>
               </w:rPr>
+              <w:t>ancho × alto × 3 × FPS =</w:t>
             </w:r>
           </w:p>
         </w:tc>

</xml_diff>